<commit_message>
Strengthen Lab 2 theory and analysis workflow
</commit_message>
<xml_diff>
--- a/site/docs/LAB2_MIE402.docx
+++ b/site/docs/LAB2_MIE402.docx
@@ -89,7 +89,7 @@
         <w:pStyle w:val="ListBullet"/>
       </w:pPr>
       <w:r>
-        <w:t>Single-pendulum assembly, black background, protractor, calibration marks, and scale.</w:t>
+        <w:t>Single-pendulum assembly, black background, protractor, calibration marks, and scale or balance.</w:t>
       </w:r>
     </w:p>
     <w:p>
@@ -121,7 +121,7 @@
         <w:pStyle w:val="ListBullet"/>
       </w:pPr>
       <w:r>
-        <w:t>Every trial begins from rest. Record initial angle, length to bob center, relevant masses, frame rate, calibration distance, and file name.</w:t>
+        <w:t>Every trial begins from rest. Record initial angle, pivot-to-bob distance l, bob mass M, bar mass m, frame rate, calibration distance, and file name.</w:t>
       </w:r>
     </w:p>
     <w:p>
@@ -173,6 +173,29 @@
           <w:sz w:val="18"/>
         </w:rPr>
         <w:t>Figure 1. Single-pendulum apparatus. Track the center of the bob and use the pivot rotation center as reference.</w:t>
+      </w:r>
+    </w:p>
+    <w:p>
+      <w:pPr>
+        <w:pStyle w:val="Heading1"/>
+      </w:pPr>
+      <w:r>
+        <w:t>Model of the actual apparatus</w:t>
+      </w:r>
+    </w:p>
+    <w:p>
+      <w:r>
+        <w:t>The common point-mass formula assumes a massless bar. The laboratory bar has measurable mass, so use a compound-pendulum model. Let M be the bob and attached hardware mass, m the uniform bar mass, and l the distance from pivot to bob center. The bar center of mass lies at l/2 and its pivot inertia is ml^2/3.</w:t>
+      </w:r>
+    </w:p>
+    <w:p>
+      <w:r>
+        <w:t>(M l^2 + m l^2/3) theta double dot + (M g l + m g l/2) sin(theta) = 0</w:t>
+      </w:r>
+    </w:p>
+    <w:p>
+      <w:r>
+        <w:t>For small angles in radians: omega_n^2 = g(M + m/2) / [l(M + m/3)]. The ideal point-mass result sqrt(g/l) follows only when m is negligible. Use the compound model for the theoretical frequency reported for the real apparatus. For large initial angles, solve the nonlinear equation numerically because sin(theta) cannot be replaced by theta.</w:t>
       </w:r>
     </w:p>
     <w:p>
@@ -731,7 +754,7 @@
     </w:p>
     <w:p>
       <w:r>
-        <w:t>The saved ExpData matrix contains time and tracked coordinates. For a single pendulum use time and bob-1 x and y; confirm exact column order in the app. With pivot xp, yp and bob xb, yb, calculate theta = atan2(xb - xp, yp - yb). Use radians in equations and label degree plots clearly.</w:t>
+        <w:t>The app saves ExpData. Column 1 is time in seconds, columns 2 and 3 are bob 1 x and y in millimeters, and columns 4 and 5 are bob 2 x and y when a second bob is used. Lab 2 uses columns 1 to 3. Record the pivot coordinates selected in the app. In standard image coordinates, y increases downward, so calculate theta = atan2(xb - xp, yb - yp). This gives theta = 0 when the bob hangs below the pivot. Verify the sign with a known frame before processing all trials. Use radians in equations and label degree plots clearly.</w:t>
       </w:r>
     </w:p>
     <w:p>
@@ -739,7 +762,7 @@
         <w:pStyle w:val="ListBullet"/>
       </w:pPr>
       <w:r>
-        <w:t>For each trial plot theta(t) and angular velocity. State derivative method and any smoothing.</w:t>
+        <w:t>For each trial plot theta(t) and angular velocity. State the numerical derivative and any smoothing method. Do not smooth until tracking errors have been checked.</w:t>
       </w:r>
     </w:p>
     <w:p>
@@ -747,7 +770,7 @@
         <w:pStyle w:val="ListBullet"/>
       </w:pPr>
       <w:r>
-        <w:t>Plot spectra for theta and angular velocity. Report dominant frequency and FFT-bin spacing.</w:t>
+        <w:t>Estimate period from several same-direction peaks in theta(t), not from one cycle. Report the interval and number of cycles used.</w:t>
       </w:r>
     </w:p>
     <w:p>
@@ -755,7 +778,7 @@
         <w:pStyle w:val="ListBullet"/>
       </w:pPr>
       <w:r>
-        <w:t>Calculate small-angle frequency sqrt(g/L)/(2pi). For larger angles compare with nonlinear model or explain small-angle limitation.</w:t>
+        <w:t>Plot spectra for theta and angular velocity after removing the mean. Report dominant frequency, record duration, and FFT-bin spacing Delta f = 1/T_record.</w:t>
       </w:r>
     </w:p>
     <w:p>
@@ -763,7 +786,7 @@
         <w:pStyle w:val="ListBullet"/>
       </w:pPr>
       <w:r>
-        <w:t>Create a table of length, mass, initial angle, theoretical frequency, time-domain frequency, spectral frequency, and meaningful differences.</w:t>
+        <w:t>Calculate the compound-pendulum small-angle frequency. Compare the low-angle trial with this value and compare all three trials with the nonlinear numerical model from Pre-Lab 2.</w:t>
       </w:r>
     </w:p>
     <w:p>
@@ -771,7 +794,63 @@
         <w:pStyle w:val="ListBullet"/>
       </w:pPr>
       <w:r>
-        <w:t>Discuss camera calibration, tracking error, air resistance, pivot friction, finite angle, and release error.</w:t>
+        <w:t>Create a table of l, M, m, initial angle, compound-model frequency, time-domain frequency, spectral frequency, and percent difference.</w:t>
+      </w:r>
+    </w:p>
+    <w:p>
+      <w:pPr>
+        <w:pStyle w:val="ListBullet"/>
+      </w:pPr>
+      <w:r>
+        <w:t>Discuss model assumptions separately from measurement errors: finite angle and damping affect the physics; calibration, tracking, timing, and release error affect the measurement.</w:t>
+      </w:r>
+    </w:p>
+    <w:p>
+      <w:pPr>
+        <w:pStyle w:val="Heading1"/>
+      </w:pPr>
+      <w:r>
+        <w:t>Required evidence for the combined Labs 2 and 3 report</w:t>
+      </w:r>
+    </w:p>
+    <w:p>
+      <w:pPr>
+        <w:pStyle w:val="ListBullet"/>
+      </w:pPr>
+      <w:r>
+        <w:t>A labeled apparatus schematic defining pivot, l, M, m, theta, and the positive direction.</w:t>
+      </w:r>
+    </w:p>
+    <w:p>
+      <w:pPr>
+        <w:pStyle w:val="ListBullet"/>
+      </w:pPr>
+      <w:r>
+        <w:t>A measurement table with units, camera settings, calibration distance, and every source file name.</w:t>
+      </w:r>
+    </w:p>
+    <w:p>
+      <w:pPr>
+        <w:pStyle w:val="ListBullet"/>
+      </w:pPr>
+      <w:r>
+        <w:t>For each Lab 2 angle: theta(t), angular velocity, and spectra with readable axes and captions.</w:t>
+      </w:r>
+    </w:p>
+    <w:p>
+      <w:pPr>
+        <w:pStyle w:val="ListBullet"/>
+      </w:pPr>
+      <w:r>
+        <w:t>A comparison table containing analytical small-angle, nonlinear simulation, time-domain, and FFT estimates.</w:t>
+      </w:r>
+    </w:p>
+    <w:p>
+      <w:pPr>
+        <w:pStyle w:val="ListBullet"/>
+      </w:pPr>
+      <w:r>
+        <w:t>A discussion that explains why period grows with initial angle and why the bar mass changes the small-angle prediction.</w:t>
       </w:r>
     </w:p>
     <w:p>

</xml_diff>

<commit_message>
Typeset Lab 2 equations professionally
</commit_message>
<xml_diff>
--- a/site/docs/LAB2_MIE402.docx
+++ b/site/docs/LAB2_MIE402.docx
@@ -189,13 +189,133 @@
       </w:r>
     </w:p>
     <w:p>
+      <w:pPr>
+        <w:spacing w:before="80" w:after="140"/>
+        <w:jc w:val="center"/>
+      </w:pPr>
       <w:r>
-        <w:t>(M l^2 + m l^2/3) theta double dot + (M g l + m g l/2) sin(theta) = 0</w:t>
+        <w:drawing>
+          <wp:inline xmlns:a="http://schemas.openxmlformats.org/drawingml/2006/main" xmlns:pic="http://schemas.openxmlformats.org/drawingml/2006/picture">
+            <wp:extent cx="5212080" cy="431535"/>
+            <wp:docPr id="2" name="Picture 2"/>
+            <wp:cNvGraphicFramePr>
+              <a:graphicFrameLocks noChangeAspect="1"/>
+            </wp:cNvGraphicFramePr>
+            <a:graphic>
+              <a:graphicData uri="http://schemas.openxmlformats.org/drawingml/2006/picture">
+                <pic:pic>
+                  <pic:nvPicPr>
+                    <pic:cNvPr id="0" name="compound_eom-black.png"/>
+                    <pic:cNvPicPr/>
+                  </pic:nvPicPr>
+                  <pic:blipFill>
+                    <a:blip r:embed="rId10"/>
+                    <a:stretch>
+                      <a:fillRect/>
+                    </a:stretch>
+                  </pic:blipFill>
+                  <pic:spPr>
+                    <a:xfrm>
+                      <a:off x="0" y="0"/>
+                      <a:ext cx="5212080" cy="431535"/>
+                    </a:xfrm>
+                    <a:prstGeom prst="rect"/>
+                  </pic:spPr>
+                </pic:pic>
+              </a:graphicData>
+            </a:graphic>
+          </wp:inline>
+        </w:drawing>
       </w:r>
     </w:p>
     <w:p>
       <w:r>
-        <w:t>For small angles in radians: omega_n^2 = g(M + m/2) / [l(M + m/3)]. The ideal point-mass result sqrt(g/l) follows only when m is negligible. Use the compound model for the theoretical frequency reported for the real apparatus. For large initial angles, solve the nonlinear equation numerically because sin(theta) cannot be replaced by theta.</w:t>
+        <w:t>For small angles, use radians and replace sin(theta) with theta:</w:t>
+      </w:r>
+    </w:p>
+    <w:p>
+      <w:pPr>
+        <w:spacing w:before="80" w:after="140"/>
+        <w:jc w:val="center"/>
+      </w:pPr>
+      <w:r>
+        <w:drawing>
+          <wp:inline xmlns:a="http://schemas.openxmlformats.org/drawingml/2006/main" xmlns:pic="http://schemas.openxmlformats.org/drawingml/2006/picture">
+            <wp:extent cx="5303520" cy="634263"/>
+            <wp:docPr id="3" name="Picture 3"/>
+            <wp:cNvGraphicFramePr>
+              <a:graphicFrameLocks noChangeAspect="1"/>
+            </wp:cNvGraphicFramePr>
+            <a:graphic>
+              <a:graphicData uri="http://schemas.openxmlformats.org/drawingml/2006/picture">
+                <pic:pic>
+                  <pic:nvPicPr>
+                    <pic:cNvPr id="0" name="small_angle-black.png"/>
+                    <pic:cNvPicPr/>
+                  </pic:nvPicPr>
+                  <pic:blipFill>
+                    <a:blip r:embed="rId11"/>
+                    <a:stretch>
+                      <a:fillRect/>
+                    </a:stretch>
+                  </pic:blipFill>
+                  <pic:spPr>
+                    <a:xfrm>
+                      <a:off x="0" y="0"/>
+                      <a:ext cx="5303520" cy="634263"/>
+                    </a:xfrm>
+                    <a:prstGeom prst="rect"/>
+                  </pic:spPr>
+                </pic:pic>
+              </a:graphicData>
+            </a:graphic>
+          </wp:inline>
+        </w:drawing>
+      </w:r>
+    </w:p>
+    <w:p>
+      <w:pPr>
+        <w:spacing w:before="80" w:after="140"/>
+        <w:jc w:val="center"/>
+      </w:pPr>
+      <w:r>
+        <w:drawing>
+          <wp:inline xmlns:a="http://schemas.openxmlformats.org/drawingml/2006/main" xmlns:pic="http://schemas.openxmlformats.org/drawingml/2006/picture">
+            <wp:extent cx="3291840" cy="430370"/>
+            <wp:docPr id="4" name="Picture 4"/>
+            <wp:cNvGraphicFramePr>
+              <a:graphicFrameLocks noChangeAspect="1"/>
+            </wp:cNvGraphicFramePr>
+            <a:graphic>
+              <a:graphicData uri="http://schemas.openxmlformats.org/drawingml/2006/picture">
+                <pic:pic>
+                  <pic:nvPicPr>
+                    <pic:cNvPr id="0" name="frequency_period-black.png"/>
+                    <pic:cNvPicPr/>
+                  </pic:nvPicPr>
+                  <pic:blipFill>
+                    <a:blip r:embed="rId12"/>
+                    <a:stretch>
+                      <a:fillRect/>
+                    </a:stretch>
+                  </pic:blipFill>
+                  <pic:spPr>
+                    <a:xfrm>
+                      <a:off x="0" y="0"/>
+                      <a:ext cx="3291840" cy="430370"/>
+                    </a:xfrm>
+                    <a:prstGeom prst="rect"/>
+                  </pic:spPr>
+                </pic:pic>
+              </a:graphicData>
+            </a:graphic>
+          </wp:inline>
+        </w:drawing>
+      </w:r>
+    </w:p>
+    <w:p>
+      <w:r>
+        <w:t>The ideal point-mass result follows only when bar mass is negligible. Use the compound model for the theoretical frequency of the real apparatus. For large initial angles, solve the nonlinear equation numerically because sin(theta) cannot be replaced by theta.</w:t>
       </w:r>
     </w:p>
     <w:p>
@@ -214,7 +334,7 @@
         <w:drawing>
           <wp:inline xmlns:a="http://schemas.openxmlformats.org/drawingml/2006/main" xmlns:pic="http://schemas.openxmlformats.org/drawingml/2006/picture">
             <wp:extent cx="4937760" cy="3057286"/>
-            <wp:docPr id="2" name="Picture 2"/>
+            <wp:docPr id="5" name="Picture 5"/>
             <wp:cNvGraphicFramePr>
               <a:graphicFrameLocks noChangeAspect="1"/>
             </wp:cNvGraphicFramePr>
@@ -226,7 +346,7 @@
                     <pic:cNvPicPr/>
                   </pic:nvPicPr>
                   <pic:blipFill>
-                    <a:blip r:embed="rId10"/>
+                    <a:blip r:embed="rId13"/>
                     <a:stretch>
                       <a:fillRect/>
                     </a:stretch>
@@ -318,7 +438,7 @@
         <w:drawing>
           <wp:inline xmlns:a="http://schemas.openxmlformats.org/drawingml/2006/main" xmlns:pic="http://schemas.openxmlformats.org/drawingml/2006/picture">
             <wp:extent cx="4114800" cy="2468880"/>
-            <wp:docPr id="3" name="Picture 3"/>
+            <wp:docPr id="6" name="Picture 6"/>
             <wp:cNvGraphicFramePr>
               <a:graphicFrameLocks noChangeAspect="1"/>
             </wp:cNvGraphicFramePr>
@@ -330,7 +450,7 @@
                     <pic:cNvPicPr/>
                   </pic:nvPicPr>
                   <pic:blipFill>
-                    <a:blip r:embed="rId11"/>
+                    <a:blip r:embed="rId14"/>
                     <a:stretch>
                       <a:fillRect/>
                     </a:stretch>
@@ -369,7 +489,7 @@
         <w:drawing>
           <wp:inline xmlns:a="http://schemas.openxmlformats.org/drawingml/2006/main" xmlns:pic="http://schemas.openxmlformats.org/drawingml/2006/picture">
             <wp:extent cx="4663440" cy="2798064"/>
-            <wp:docPr id="4" name="Picture 4"/>
+            <wp:docPr id="7" name="Picture 7"/>
             <wp:cNvGraphicFramePr>
               <a:graphicFrameLocks noChangeAspect="1"/>
             </wp:cNvGraphicFramePr>
@@ -381,7 +501,7 @@
                     <pic:cNvPicPr/>
                   </pic:nvPicPr>
                   <pic:blipFill>
-                    <a:blip r:embed="rId12"/>
+                    <a:blip r:embed="rId15"/>
                     <a:stretch>
                       <a:fillRect/>
                     </a:stretch>
@@ -508,7 +628,7 @@
         <w:drawing>
           <wp:inline xmlns:a="http://schemas.openxmlformats.org/drawingml/2006/main" xmlns:pic="http://schemas.openxmlformats.org/drawingml/2006/picture">
             <wp:extent cx="4572000" cy="2756848"/>
-            <wp:docPr id="5" name="Picture 5"/>
+            <wp:docPr id="8" name="Picture 8"/>
             <wp:cNvGraphicFramePr>
               <a:graphicFrameLocks noChangeAspect="1"/>
             </wp:cNvGraphicFramePr>
@@ -520,7 +640,7 @@
                     <pic:cNvPicPr/>
                   </pic:nvPicPr>
                   <pic:blipFill>
-                    <a:blip r:embed="rId13"/>
+                    <a:blip r:embed="rId16"/>
                     <a:stretch>
                       <a:fillRect/>
                     </a:stretch>
@@ -567,7 +687,7 @@
         <w:drawing>
           <wp:inline xmlns:a="http://schemas.openxmlformats.org/drawingml/2006/main" xmlns:pic="http://schemas.openxmlformats.org/drawingml/2006/picture">
             <wp:extent cx="5303520" cy="3670515"/>
-            <wp:docPr id="6" name="Picture 6"/>
+            <wp:docPr id="9" name="Picture 9"/>
             <wp:cNvGraphicFramePr>
               <a:graphicFrameLocks noChangeAspect="1"/>
             </wp:cNvGraphicFramePr>
@@ -579,7 +699,7 @@
                     <pic:cNvPicPr/>
                   </pic:nvPicPr>
                   <pic:blipFill>
-                    <a:blip r:embed="rId14"/>
+                    <a:blip r:embed="rId17"/>
                     <a:stretch>
                       <a:fillRect/>
                     </a:stretch>
@@ -650,7 +770,7 @@
         <w:drawing>
           <wp:inline xmlns:a="http://schemas.openxmlformats.org/drawingml/2006/main" xmlns:pic="http://schemas.openxmlformats.org/drawingml/2006/picture">
             <wp:extent cx="5486400" cy="3797085"/>
-            <wp:docPr id="7" name="Picture 7"/>
+            <wp:docPr id="10" name="Picture 10"/>
             <wp:cNvGraphicFramePr>
               <a:graphicFrameLocks noChangeAspect="1"/>
             </wp:cNvGraphicFramePr>
@@ -662,7 +782,7 @@
                     <pic:cNvPicPr/>
                   </pic:nvPicPr>
                   <pic:blipFill>
-                    <a:blip r:embed="rId15"/>
+                    <a:blip r:embed="rId18"/>
                     <a:stretch>
                       <a:fillRect/>
                     </a:stretch>
@@ -701,7 +821,7 @@
         <w:drawing>
           <wp:inline xmlns:a="http://schemas.openxmlformats.org/drawingml/2006/main" xmlns:pic="http://schemas.openxmlformats.org/drawingml/2006/picture">
             <wp:extent cx="5486400" cy="3797085"/>
-            <wp:docPr id="8" name="Picture 8"/>
+            <wp:docPr id="11" name="Picture 11"/>
             <wp:cNvGraphicFramePr>
               <a:graphicFrameLocks noChangeAspect="1"/>
             </wp:cNvGraphicFramePr>
@@ -713,7 +833,7 @@
                     <pic:cNvPicPr/>
                   </pic:nvPicPr>
                   <pic:blipFill>
-                    <a:blip r:embed="rId16"/>
+                    <a:blip r:embed="rId19"/>
                     <a:stretch>
                       <a:fillRect/>
                     </a:stretch>
@@ -754,7 +874,172 @@
     </w:p>
     <w:p>
       <w:r>
-        <w:t>The app saves ExpData. Column 1 is time in seconds, columns 2 and 3 are bob 1 x and y in millimeters, and columns 4 and 5 are bob 2 x and y when a second bob is used. Lab 2 uses columns 1 to 3. Record the pivot coordinates selected in the app. In standard image coordinates, y increases downward, so calculate theta = atan2(xb - xp, yb - yp). This gives theta = 0 when the bob hangs below the pivot. Verify the sign with a known frame before processing all trials. Use radians in equations and label degree plots clearly.</w:t>
+        <w:t>The app saves ExpData. Column 1 is time in seconds, columns 2 and 3 are bob 1 x and y in millimeters, and columns 4 and 5 are bob 2 x and y when a second bob is used. Lab 2 uses columns 1 to 3. Record the pivot coordinates selected in the app. In standard image coordinates, y increases downward, so calculate angle as follows:</w:t>
+      </w:r>
+    </w:p>
+    <w:p>
+      <w:pPr>
+        <w:spacing w:before="80" w:after="140"/>
+        <w:jc w:val="center"/>
+      </w:pPr>
+      <w:r>
+        <w:drawing>
+          <wp:inline xmlns:a="http://schemas.openxmlformats.org/drawingml/2006/main" xmlns:pic="http://schemas.openxmlformats.org/drawingml/2006/picture">
+            <wp:extent cx="3931920" cy="532611"/>
+            <wp:docPr id="12" name="Picture 12"/>
+            <wp:cNvGraphicFramePr>
+              <a:graphicFrameLocks noChangeAspect="1"/>
+            </wp:cNvGraphicFramePr>
+            <a:graphic>
+              <a:graphicData uri="http://schemas.openxmlformats.org/drawingml/2006/picture">
+                <pic:pic>
+                  <pic:nvPicPr>
+                    <pic:cNvPr id="0" name="angle-black.png"/>
+                    <pic:cNvPicPr/>
+                  </pic:nvPicPr>
+                  <pic:blipFill>
+                    <a:blip r:embed="rId20"/>
+                    <a:stretch>
+                      <a:fillRect/>
+                    </a:stretch>
+                  </pic:blipFill>
+                  <pic:spPr>
+                    <a:xfrm>
+                      <a:off x="0" y="0"/>
+                      <a:ext cx="3931920" cy="532611"/>
+                    </a:xfrm>
+                    <a:prstGeom prst="rect"/>
+                  </pic:spPr>
+                </pic:pic>
+              </a:graphicData>
+            </a:graphic>
+          </wp:inline>
+        </w:drawing>
+      </w:r>
+    </w:p>
+    <w:p>
+      <w:r>
+        <w:t>This definition gives theta = 0 when the bob hangs below the pivot. Verify the sign with a known frame before processing all trials. Use radians in equations and label degree plots clearly.</w:t>
+      </w:r>
+    </w:p>
+    <w:p>
+      <w:pPr>
+        <w:spacing w:before="80" w:after="140"/>
+        <w:jc w:val="center"/>
+      </w:pPr>
+      <w:r>
+        <w:drawing>
+          <wp:inline xmlns:a="http://schemas.openxmlformats.org/drawingml/2006/main" xmlns:pic="http://schemas.openxmlformats.org/drawingml/2006/picture">
+            <wp:extent cx="3383280" cy="761529"/>
+            <wp:docPr id="13" name="Picture 13"/>
+            <wp:cNvGraphicFramePr>
+              <a:graphicFrameLocks noChangeAspect="1"/>
+            </wp:cNvGraphicFramePr>
+            <a:graphic>
+              <a:graphicData uri="http://schemas.openxmlformats.org/drawingml/2006/picture">
+                <pic:pic>
+                  <pic:nvPicPr>
+                    <pic:cNvPr id="0" name="omega-black.png"/>
+                    <pic:cNvPicPr/>
+                  </pic:nvPicPr>
+                  <pic:blipFill>
+                    <a:blip r:embed="rId21"/>
+                    <a:stretch>
+                      <a:fillRect/>
+                    </a:stretch>
+                  </pic:blipFill>
+                  <pic:spPr>
+                    <a:xfrm>
+                      <a:off x="0" y="0"/>
+                      <a:ext cx="3383280" cy="761529"/>
+                    </a:xfrm>
+                    <a:prstGeom prst="rect"/>
+                  </pic:spPr>
+                </pic:pic>
+              </a:graphicData>
+            </a:graphic>
+          </wp:inline>
+        </w:drawing>
+      </w:r>
+    </w:p>
+    <w:p>
+      <w:pPr>
+        <w:spacing w:before="80" w:after="140"/>
+        <w:jc w:val="center"/>
+      </w:pPr>
+      <w:r>
+        <w:drawing>
+          <wp:inline xmlns:a="http://schemas.openxmlformats.org/drawingml/2006/main" xmlns:pic="http://schemas.openxmlformats.org/drawingml/2006/picture">
+            <wp:extent cx="3474720" cy="468783"/>
+            <wp:docPr id="14" name="Picture 14"/>
+            <wp:cNvGraphicFramePr>
+              <a:graphicFrameLocks noChangeAspect="1"/>
+            </wp:cNvGraphicFramePr>
+            <a:graphic>
+              <a:graphicData uri="http://schemas.openxmlformats.org/drawingml/2006/picture">
+                <pic:pic>
+                  <pic:nvPicPr>
+                    <pic:cNvPr id="0" name="period-black.png"/>
+                    <pic:cNvPicPr/>
+                  </pic:nvPicPr>
+                  <pic:blipFill>
+                    <a:blip r:embed="rId22"/>
+                    <a:stretch>
+                      <a:fillRect/>
+                    </a:stretch>
+                  </pic:blipFill>
+                  <pic:spPr>
+                    <a:xfrm>
+                      <a:off x="0" y="0"/>
+                      <a:ext cx="3474720" cy="468783"/>
+                    </a:xfrm>
+                    <a:prstGeom prst="rect"/>
+                  </pic:spPr>
+                </pic:pic>
+              </a:graphicData>
+            </a:graphic>
+          </wp:inline>
+        </w:drawing>
+      </w:r>
+    </w:p>
+    <w:p>
+      <w:pPr>
+        <w:spacing w:before="80" w:after="140"/>
+        <w:jc w:val="center"/>
+      </w:pPr>
+      <w:r>
+        <w:drawing>
+          <wp:inline xmlns:a="http://schemas.openxmlformats.org/drawingml/2006/main" xmlns:pic="http://schemas.openxmlformats.org/drawingml/2006/picture">
+            <wp:extent cx="3383280" cy="713703"/>
+            <wp:docPr id="15" name="Picture 15"/>
+            <wp:cNvGraphicFramePr>
+              <a:graphicFrameLocks noChangeAspect="1"/>
+            </wp:cNvGraphicFramePr>
+            <a:graphic>
+              <a:graphicData uri="http://schemas.openxmlformats.org/drawingml/2006/picture">
+                <pic:pic>
+                  <pic:nvPicPr>
+                    <pic:cNvPr id="0" name="resolution-black.png"/>
+                    <pic:cNvPicPr/>
+                  </pic:nvPicPr>
+                  <pic:blipFill>
+                    <a:blip r:embed="rId23"/>
+                    <a:stretch>
+                      <a:fillRect/>
+                    </a:stretch>
+                  </pic:blipFill>
+                  <pic:spPr>
+                    <a:xfrm>
+                      <a:off x="0" y="0"/>
+                      <a:ext cx="3383280" cy="713703"/>
+                    </a:xfrm>
+                    <a:prstGeom prst="rect"/>
+                  </pic:spPr>
+                </pic:pic>
+              </a:graphicData>
+            </a:graphic>
+          </wp:inline>
+        </w:drawing>
       </w:r>
     </w:p>
     <w:p>
@@ -894,7 +1179,7 @@
       </w:r>
     </w:p>
     <w:sectPr>
-      <w:footerReference w:type="default" r:id="rId17"/>
+      <w:footerReference w:type="default" r:id="rId24"/>
       <w:pgSz w:w="12240" w:h="15840"/>
       <w:pgMar w:top="936" w:right="1080" w:bottom="936" w:left="1080" w:header="720" w:footer="720" w:gutter="0"/>
       <w:cols w:space="720"/>

</xml_diff>

<commit_message>
Fix Lab 2 mathematical subscripts
</commit_message>
<xml_diff>
--- a/site/docs/LAB2_MIE402.docx
+++ b/site/docs/LAB2_MIE402.docx
@@ -885,7 +885,7 @@
       <w:r>
         <w:drawing>
           <wp:inline xmlns:a="http://schemas.openxmlformats.org/drawingml/2006/main" xmlns:pic="http://schemas.openxmlformats.org/drawingml/2006/picture">
-            <wp:extent cx="3931920" cy="532611"/>
+            <wp:extent cx="3931920" cy="544979"/>
             <wp:docPr id="12" name="Picture 12"/>
             <wp:cNvGraphicFramePr>
               <a:graphicFrameLocks noChangeAspect="1"/>
@@ -906,7 +906,7 @@
                   <pic:spPr>
                     <a:xfrm>
                       <a:off x="0" y="0"/>
-                      <a:ext cx="3931920" cy="532611"/>
+                      <a:ext cx="3931920" cy="544979"/>
                     </a:xfrm>
                     <a:prstGeom prst="rect"/>
                   </pic:spPr>

</xml_diff>

<commit_message>
Improve Lab 2 formulas and explain damping
</commit_message>
<xml_diff>
--- a/site/docs/LAB2_MIE402.docx
+++ b/site/docs/LAB2_MIE402.docx
@@ -196,7 +196,7 @@
       <w:r>
         <w:drawing>
           <wp:inline xmlns:a="http://schemas.openxmlformats.org/drawingml/2006/main" xmlns:pic="http://schemas.openxmlformats.org/drawingml/2006/picture">
-            <wp:extent cx="5212080" cy="431535"/>
+            <wp:extent cx="3402747" cy="512064"/>
             <wp:docPr id="2" name="Picture 2"/>
             <wp:cNvGraphicFramePr>
               <a:graphicFrameLocks noChangeAspect="1"/>
@@ -217,7 +217,7 @@
                   <pic:spPr>
                     <a:xfrm>
                       <a:off x="0" y="0"/>
-                      <a:ext cx="5212080" cy="431535"/>
+                      <a:ext cx="3402747" cy="512064"/>
                     </a:xfrm>
                     <a:prstGeom prst="rect"/>
                   </pic:spPr>
@@ -241,7 +241,7 @@
       <w:r>
         <w:drawing>
           <wp:inline xmlns:a="http://schemas.openxmlformats.org/drawingml/2006/main" xmlns:pic="http://schemas.openxmlformats.org/drawingml/2006/picture">
-            <wp:extent cx="5303520" cy="634263"/>
+            <wp:extent cx="1165502" cy="594360"/>
             <wp:docPr id="3" name="Picture 3"/>
             <wp:cNvGraphicFramePr>
               <a:graphicFrameLocks noChangeAspect="1"/>
@@ -262,7 +262,7 @@
                   <pic:spPr>
                     <a:xfrm>
                       <a:off x="0" y="0"/>
-                      <a:ext cx="5303520" cy="634263"/>
+                      <a:ext cx="1165502" cy="594360"/>
                     </a:xfrm>
                     <a:prstGeom prst="rect"/>
                   </pic:spPr>
@@ -281,7 +281,7 @@
       <w:r>
         <w:drawing>
           <wp:inline xmlns:a="http://schemas.openxmlformats.org/drawingml/2006/main" xmlns:pic="http://schemas.openxmlformats.org/drawingml/2006/picture">
-            <wp:extent cx="3291840" cy="430370"/>
+            <wp:extent cx="1577501" cy="475488"/>
             <wp:docPr id="4" name="Picture 4"/>
             <wp:cNvGraphicFramePr>
               <a:graphicFrameLocks noChangeAspect="1"/>
@@ -302,7 +302,7 @@
                   <pic:spPr>
                     <a:xfrm>
                       <a:off x="0" y="0"/>
-                      <a:ext cx="3291840" cy="430370"/>
+                      <a:ext cx="1577501" cy="475488"/>
                     </a:xfrm>
                     <a:prstGeom prst="rect"/>
                   </pic:spPr>
@@ -885,7 +885,7 @@
       <w:r>
         <w:drawing>
           <wp:inline xmlns:a="http://schemas.openxmlformats.org/drawingml/2006/main" xmlns:pic="http://schemas.openxmlformats.org/drawingml/2006/picture">
-            <wp:extent cx="3931920" cy="544979"/>
+            <wp:extent cx="2705395" cy="393192"/>
             <wp:docPr id="12" name="Picture 12"/>
             <wp:cNvGraphicFramePr>
               <a:graphicFrameLocks noChangeAspect="1"/>
@@ -906,7 +906,7 @@
                   <pic:spPr>
                     <a:xfrm>
                       <a:off x="0" y="0"/>
-                      <a:ext cx="3931920" cy="544979"/>
+                      <a:ext cx="2705395" cy="393192"/>
                     </a:xfrm>
                     <a:prstGeom prst="rect"/>
                   </pic:spPr>
@@ -930,7 +930,7 @@
       <w:r>
         <w:drawing>
           <wp:inline xmlns:a="http://schemas.openxmlformats.org/drawingml/2006/main" xmlns:pic="http://schemas.openxmlformats.org/drawingml/2006/picture">
-            <wp:extent cx="3383280" cy="761529"/>
+            <wp:extent cx="1914340" cy="502920"/>
             <wp:docPr id="13" name="Picture 13"/>
             <wp:cNvGraphicFramePr>
               <a:graphicFrameLocks noChangeAspect="1"/>
@@ -951,7 +951,7 @@
                   <pic:spPr>
                     <a:xfrm>
                       <a:off x="0" y="0"/>
-                      <a:ext cx="3383280" cy="761529"/>
+                      <a:ext cx="1914340" cy="502920"/>
                     </a:xfrm>
                     <a:prstGeom prst="rect"/>
                   </pic:spPr>
@@ -970,7 +970,7 @@
       <w:r>
         <w:drawing>
           <wp:inline xmlns:a="http://schemas.openxmlformats.org/drawingml/2006/main" xmlns:pic="http://schemas.openxmlformats.org/drawingml/2006/picture">
-            <wp:extent cx="3474720" cy="468783"/>
+            <wp:extent cx="1833429" cy="438912"/>
             <wp:docPr id="14" name="Picture 14"/>
             <wp:cNvGraphicFramePr>
               <a:graphicFrameLocks noChangeAspect="1"/>
@@ -991,7 +991,7 @@
                   <pic:spPr>
                     <a:xfrm>
                       <a:off x="0" y="0"/>
-                      <a:ext cx="3474720" cy="468783"/>
+                      <a:ext cx="1833429" cy="438912"/>
                     </a:xfrm>
                     <a:prstGeom prst="rect"/>
                   </pic:spPr>
@@ -1010,7 +1010,7 @@
       <w:r>
         <w:drawing>
           <wp:inline xmlns:a="http://schemas.openxmlformats.org/drawingml/2006/main" xmlns:pic="http://schemas.openxmlformats.org/drawingml/2006/picture">
-            <wp:extent cx="3383280" cy="713703"/>
+            <wp:extent cx="1492811" cy="493776"/>
             <wp:docPr id="15" name="Picture 15"/>
             <wp:cNvGraphicFramePr>
               <a:graphicFrameLocks noChangeAspect="1"/>
@@ -1031,7 +1031,7 @@
                   <pic:spPr>
                     <a:xfrm>
                       <a:off x="0" y="0"/>
-                      <a:ext cx="3383280" cy="713703"/>
+                      <a:ext cx="1492811" cy="493776"/>
                     </a:xfrm>
                     <a:prstGeom prst="rect"/>
                   </pic:spPr>

</xml_diff>